<commit_message>
test first test case
</commit_message>
<xml_diff>
--- a/Lab4_TestScript.docx
+++ b/Lab4_TestScript.docx
@@ -1,7 +1,100 @@
 
 <file path=word/document.xml><?xml version="1.0" encoding="utf-8"?>
-<w:document xmlns:wpc="http://schemas.microsoft.com/office/word/2010/wordprocessingCanvas" xmlns:cx="http://schemas.microsoft.com/office/drawing/2014/chartex" xmlns:cx1="http://schemas.microsoft.com/office/drawing/2015/9/8/chartex" xmlns:cx2="http://schemas.microsoft.com/office/drawing/2015/10/21/chartex" xmlns:cx3="http://schemas.microsoft.com/office/drawing/2016/5/9/chartex" xmlns:cx4="http://schemas.microsoft.com/office/drawing/2016/5/10/chartex" xmlns:cx5="http://schemas.microsoft.com/office/drawing/2016/5/11/chartex" xmlns:cx6="http://schemas.microsoft.com/office/drawing/2016/5/12/chartex" xmlns:cx7="http://schemas.microsoft.com/office/drawing/2016/5/13/chartex" xmlns:cx8="http://schemas.microsoft.com/office/drawing/2016/5/14/chartex" xmlns:mc="http://schemas.openxmlformats.org/markup-compatibility/2006" xmlns:aink="http://schemas.microsoft.com/office/drawing/2016/ink" xmlns:am3d="http://schemas.microsoft.com/office/drawing/2017/model3d" xmlns:o="urn:schemas-microsoft-com:office:office" xmlns:oel="http://schemas.microsoft.com/office/2019/extlst" xmlns:r="http://schemas.openxmlformats.org/officeDocument/2006/relationships" xmlns:m="http://schemas.openxmlformats.org/officeDocument/2006/math" xmlns:v="urn:schemas-microsoft-com:vml" xmlns:wp14="http://schemas.microsoft.com/office/word/2010/wordprocessingDrawing" xmlns:wp="http://schemas.openxmlformats.org/drawingml/2006/wordprocessingDrawing" xmlns:w10="urn:schemas-microsoft-com:office:word" xmlns:w="http://schemas.openxmlformats.org/wordprocessingml/2006/main" xmlns:w14="http://schemas.microsoft.com/office/word/2010/wordml" xmlns:w15="http://schemas.microsoft.com/office/word/2012/wordml" xmlns:w16cex="http://schemas.microsoft.com/office/word/2018/wordml/cex" xmlns:w16cid="http://schemas.microsoft.com/office/word/2016/wordml/cid" xmlns:w16="http://schemas.microsoft.com/office/word/2018/wordml" xmlns:w16du="http://schemas.microsoft.com/office/word/2023/wordml/word16du" xmlns:w16sdtdh="http://schemas.microsoft.com/office/word/2020/wordml/sdtdatahash" xmlns:w16sdtfl="http://schemas.microsoft.com/office/word/2024/wordml/sdtformatlock" xmlns:w16se="http://schemas.microsoft.com/office/word/2015/wordml/symex" xmlns:wpg="http://schemas.microsoft.com/office/word/2010/wordprocessingGroup" xmlns:wpi="http://schemas.microsoft.com/office/word/2010/wordprocessingInk" xmlns:wne="http://schemas.microsoft.com/office/word/2006/wordml" xmlns:wps="http://schemas.microsoft.com/office/word/2010/wordprocessingShape" mc:Ignorable="w14 w15 w16se w16cid w16 w16cex w16sdtdh w16sdtfl w16du wp14">
+<w:document xmlns:wpc="http://schemas.microsoft.com/office/word/2010/wordprocessingCanvas" xmlns:cx="http://schemas.microsoft.com/office/drawing/2014/chartex" xmlns:cx1="http://schemas.microsoft.com/office/drawing/2015/9/8/chartex" xmlns:cx2="http://schemas.microsoft.com/office/drawing/2015/10/21/chartex" xmlns:cx3="http://schemas.microsoft.com/office/drawing/2016/5/9/chartex" xmlns:cx4="http://schemas.microsoft.com/office/drawing/2016/5/10/chartex" xmlns:cx5="http://schemas.microsoft.com/office/drawing/2016/5/11/chartex" xmlns:cx6="http://schemas.microsoft.com/office/drawing/2016/5/12/chartex" xmlns:cx7="http://schemas.microsoft.com/office/drawing/2016/5/13/chartex" xmlns:cx8="http://schemas.microsoft.com/office/drawing/2016/5/14/chartex" xmlns:mc="http://schemas.openxmlformats.org/markup-compatibility/2006" xmlns:aink="http://schemas.microsoft.com/office/drawing/2016/ink" xmlns:am3d="http://schemas.microsoft.com/office/drawing/2017/model3d" xmlns:o="urn:schemas-microsoft-com:office:office" xmlns:r="http://schemas.openxmlformats.org/officeDocument/2006/relationships" xmlns:m="http://schemas.openxmlformats.org/officeDocument/2006/math" xmlns:v="urn:schemas-microsoft-com:vml" xmlns:wp14="http://schemas.microsoft.com/office/word/2010/wordprocessingDrawing" xmlns:wp="http://schemas.openxmlformats.org/drawingml/2006/wordprocessingDrawing" xmlns:w10="urn:schemas-microsoft-com:office:word" xmlns:w="http://schemas.openxmlformats.org/wordprocessingml/2006/main" xmlns:w14="http://schemas.microsoft.com/office/word/2010/wordml" xmlns:w15="http://schemas.microsoft.com/office/word/2012/wordml" xmlns:w16cid="http://schemas.microsoft.com/office/word/2016/wordml/cid" xmlns:w16se="http://schemas.microsoft.com/office/word/2015/wordml/symex" xmlns:wpg="http://schemas.microsoft.com/office/word/2010/wordprocessingGroup" xmlns:wpi="http://schemas.microsoft.com/office/word/2010/wordprocessingInk" xmlns:wne="http://schemas.microsoft.com/office/word/2006/wordml" xmlns:wps="http://schemas.microsoft.com/office/word/2010/wordprocessingShape" mc:Ignorable="w14 w15 w16se w16cid wp14">
   <w:body>
+    <w:p>
+      <w:pPr>
+        <w:spacing w:before="240"/>
+        <w:ind w:left="357" w:hanging="357"/>
+        <w:jc w:val="right"/>
+        <w:rPr>
+          <w:rFonts w:ascii="TH Sarabun New" w:hAnsi="TH Sarabun New" w:cs="TH Sarabun New"/>
+          <w:sz w:val="32"/>
+          <w:szCs w:val="32"/>
+          <w:lang w:bidi="th-TH"/>
+        </w:rPr>
+      </w:pPr>
+      <w:r>
+        <w:rPr>
+          <w:rFonts w:ascii="TH Sarabun New" w:hAnsi="TH Sarabun New" w:cs="TH Sarabun New"/>
+          <w:sz w:val="32"/>
+          <w:szCs w:val="32"/>
+          <w:cs/>
+          <w:lang w:bidi="th-TH"/>
+        </w:rPr>
+        <w:t xml:space="preserve">ชื่อ </w:t>
+      </w:r>
+      <w:r>
+        <w:rPr>
+          <w:rFonts w:ascii="TH Sarabun New" w:hAnsi="TH Sarabun New" w:cs="TH Sarabun New" w:hint="cs"/>
+          <w:color w:val="0070C0"/>
+          <w:sz w:val="32"/>
+          <w:szCs w:val="32"/>
+          <w:cs/>
+          <w:lang w:bidi="th-TH"/>
+        </w:rPr>
+        <w:t>น</w:t>
+      </w:r>
+      <w:r>
+        <w:rPr>
+          <w:rFonts w:ascii="TH Sarabun New" w:hAnsi="TH Sarabun New" w:cs="TH Sarabun New"/>
+          <w:color w:val="0070C0"/>
+          <w:sz w:val="32"/>
+          <w:szCs w:val="32"/>
+          <w:cs/>
+          <w:lang w:bidi="th-TH"/>
+        </w:rPr>
+        <w:t xml:space="preserve">ายตะวัน อุตมาน </w:t>
+      </w:r>
+      <w:r>
+        <w:rPr>
+          <w:rFonts w:ascii="TH Sarabun New" w:hAnsi="TH Sarabun New" w:cs="TH Sarabun New"/>
+          <w:sz w:val="32"/>
+          <w:szCs w:val="32"/>
+          <w:lang w:bidi="th-TH"/>
+        </w:rPr>
+        <w:t>ID:</w:t>
+      </w:r>
+      <w:r>
+        <w:rPr>
+          <w:rFonts w:ascii="TH Sarabun New" w:hAnsi="TH Sarabun New" w:cs="TH Sarabun New"/>
+          <w:color w:val="0070C0"/>
+          <w:sz w:val="32"/>
+          <w:szCs w:val="32"/>
+          <w:lang w:bidi="th-TH"/>
+        </w:rPr>
+        <w:t xml:space="preserve"> </w:t>
+      </w:r>
+      <w:r>
+        <w:rPr>
+          <w:rFonts w:ascii="TH Sarabun New" w:hAnsi="TH Sarabun New" w:cs="TH Sarabun New"/>
+          <w:color w:val="0070C0"/>
+          <w:sz w:val="32"/>
+          <w:szCs w:val="32"/>
+          <w:lang w:bidi="th-TH"/>
+        </w:rPr>
+        <w:t xml:space="preserve">663380210-2 </w:t>
+      </w:r>
+      <w:r>
+        <w:rPr>
+          <w:rFonts w:ascii="TH Sarabun New" w:hAnsi="TH Sarabun New" w:cs="TH Sarabun New"/>
+          <w:sz w:val="32"/>
+          <w:szCs w:val="32"/>
+          <w:lang w:bidi="th-TH"/>
+        </w:rPr>
+        <w:t>Sec.</w:t>
+      </w:r>
+      <w:r>
+        <w:rPr>
+          <w:rFonts w:ascii="TH Sarabun New" w:hAnsi="TH Sarabun New" w:cs="TH Sarabun New"/>
+          <w:color w:val="0070C0"/>
+          <w:sz w:val="32"/>
+          <w:szCs w:val="32"/>
+          <w:lang w:bidi="th-TH"/>
+        </w:rPr>
+        <w:t>2</w:t>
+      </w:r>
+    </w:p>
     <w:p>
       <w:pPr>
         <w:pStyle w:val="ListParagraph"/>
@@ -782,29 +875,7 @@
           <w:cs/>
           <w:lang w:bidi="th-TH"/>
         </w:rPr>
-        <w:t>ฟอร</w:t>
-      </w:r>
-      <w:proofErr w:type="spellStart"/>
-      <w:r>
-        <w:rPr>
-          <w:rFonts w:ascii="TH SarabunPSK" w:hAnsi="TH SarabunPSK" w:cs="TH SarabunPSK" w:hint="cs"/>
-          <w:sz w:val="32"/>
-          <w:szCs w:val="32"/>
-          <w:cs/>
-          <w:lang w:bidi="th-TH"/>
-        </w:rPr>
-        <w:t>์แมต</w:t>
-      </w:r>
-      <w:proofErr w:type="spellEnd"/>
-      <w:r>
-        <w:rPr>
-          <w:rFonts w:ascii="TH SarabunPSK" w:hAnsi="TH SarabunPSK" w:cs="TH SarabunPSK" w:hint="cs"/>
-          <w:sz w:val="32"/>
-          <w:szCs w:val="32"/>
-          <w:cs/>
-          <w:lang w:bidi="th-TH"/>
-        </w:rPr>
-        <w:t xml:space="preserve">ของเบอร์โทรศัพท์ที่อนุญาตให้กรอกคือ </w:t>
+        <w:t xml:space="preserve">ฟอร์แมตของเบอร์โทรศัพท์ที่อนุญาตให้กรอกคือ </w:t>
       </w:r>
       <w:r>
         <w:rPr>
@@ -1261,29 +1332,134 @@
     <w:p>
       <w:pPr>
         <w:pStyle w:val="ListParagraph"/>
-        <w:ind w:left="360"/>
+        <w:spacing w:before="240" w:line="240" w:lineRule="auto"/>
+        <w:ind w:left="357"/>
         <w:rPr>
           <w:rFonts w:ascii="TH SarabunPSK" w:hAnsi="TH SarabunPSK" w:cs="TH SarabunPSK"/>
+          <w:color w:val="0070C0"/>
           <w:sz w:val="32"/>
           <w:szCs w:val="32"/>
         </w:rPr>
       </w:pPr>
       <w:r>
         <w:rPr>
-          <w:rFonts w:ascii="TH SarabunPSK" w:hAnsi="TH SarabunPSK" w:cs="TH SarabunPSK" w:hint="cs"/>
-          <w:sz w:val="32"/>
-          <w:szCs w:val="32"/>
-        </w:rPr>
-        <w:t>______________________________________________________________________________________________________________________________________________________________</w:t>
+          <w:rFonts w:ascii="TH SarabunPSK" w:hAnsi="TH SarabunPSK" w:cs="TH SarabunPSK"/>
+          <w:b/>
+          <w:bCs/>
+          <w:color w:val="0070C0"/>
+          <w:sz w:val="32"/>
+          <w:szCs w:val="32"/>
+        </w:rPr>
+        <w:t>CPU:</w:t>
       </w:r>
       <w:r>
         <w:rPr>
-          <w:rFonts w:ascii="TH SarabunPSK" w:hAnsi="TH SarabunPSK" w:cs="TH SarabunPSK" w:hint="cs"/>
+          <w:rFonts w:ascii="TH SarabunPSK" w:hAnsi="TH SarabunPSK" w:cs="TH SarabunPSK"/>
+          <w:color w:val="0070C0"/>
+          <w:sz w:val="32"/>
+          <w:szCs w:val="32"/>
+        </w:rPr>
+        <w:t xml:space="preserve"> Intel Core i5 12400F</w:t>
+      </w:r>
+    </w:p>
+    <w:p>
+      <w:pPr>
+        <w:pStyle w:val="ListParagraph"/>
+        <w:spacing w:before="240" w:line="240" w:lineRule="auto"/>
+        <w:ind w:left="357"/>
+        <w:rPr>
+          <w:rFonts w:ascii="TH SarabunPSK" w:hAnsi="TH SarabunPSK" w:cs="TH SarabunPSK"/>
+          <w:color w:val="0070C0"/>
+          <w:sz w:val="32"/>
+          <w:szCs w:val="32"/>
+        </w:rPr>
+      </w:pPr>
+      <w:r>
+        <w:rPr>
+          <w:rFonts w:ascii="TH SarabunPSK" w:hAnsi="TH SarabunPSK" w:cs="TH SarabunPSK"/>
+          <w:b/>
+          <w:bCs/>
+          <w:color w:val="0070C0"/>
+          <w:sz w:val="32"/>
+          <w:szCs w:val="32"/>
+        </w:rPr>
+        <w:t>Mainboard:</w:t>
+      </w:r>
+      <w:r>
+        <w:rPr>
+          <w:rFonts w:ascii="TH SarabunPSK" w:hAnsi="TH SarabunPSK" w:cs="TH SarabunPSK"/>
+          <w:color w:val="0070C0"/>
+          <w:sz w:val="32"/>
+          <w:szCs w:val="32"/>
+        </w:rPr>
+        <w:t xml:space="preserve"> PRO H610M-S</w:t>
+      </w:r>
+    </w:p>
+    <w:p>
+      <w:pPr>
+        <w:pStyle w:val="ListParagraph"/>
+        <w:spacing w:before="240" w:line="240" w:lineRule="auto"/>
+        <w:ind w:left="357"/>
+        <w:rPr>
+          <w:rFonts w:ascii="TH SarabunPSK" w:hAnsi="TH SarabunPSK" w:cs="TH SarabunPSK"/>
+          <w:color w:val="0070C0"/>
+          <w:sz w:val="32"/>
+          <w:szCs w:val="32"/>
+        </w:rPr>
+      </w:pPr>
+      <w:r>
+        <w:rPr>
+          <w:rFonts w:ascii="TH SarabunPSK" w:hAnsi="TH SarabunPSK" w:cs="TH SarabunPSK"/>
+          <w:b/>
+          <w:bCs/>
+          <w:color w:val="0070C0"/>
           <w:sz w:val="32"/>
           <w:szCs w:val="32"/>
         </w:rPr>
         <w:lastRenderedPageBreak/>
-        <w:t>______________________________________________________________________________________________________________________________________________________________</w:t>
+        <w:t>Memory:</w:t>
+      </w:r>
+      <w:r>
+        <w:rPr>
+          <w:rFonts w:ascii="TH SarabunPSK" w:hAnsi="TH SarabunPSK" w:cs="TH SarabunPSK"/>
+          <w:color w:val="0070C0"/>
+          <w:sz w:val="32"/>
+          <w:szCs w:val="32"/>
+        </w:rPr>
+        <w:t xml:space="preserve"> DDR4 32GB BUS3200</w:t>
+      </w:r>
+    </w:p>
+    <w:p>
+      <w:pPr>
+        <w:pStyle w:val="ListParagraph"/>
+        <w:spacing w:before="240" w:line="240" w:lineRule="auto"/>
+        <w:ind w:left="357"/>
+        <w:rPr>
+          <w:rFonts w:ascii="TH SarabunPSK" w:hAnsi="TH SarabunPSK" w:cs="TH SarabunPSK"/>
+          <w:color w:val="0070C0"/>
+          <w:sz w:val="32"/>
+          <w:szCs w:val="32"/>
+        </w:rPr>
+      </w:pPr>
+      <w:r>
+        <w:rPr>
+          <w:rFonts w:ascii="TH SarabunPSK" w:hAnsi="TH SarabunPSK" w:cs="TH SarabunPSK"/>
+          <w:b/>
+          <w:bCs/>
+          <w:color w:val="0070C0"/>
+          <w:sz w:val="32"/>
+          <w:szCs w:val="32"/>
+        </w:rPr>
+        <w:t>Graphics:</w:t>
+      </w:r>
+      <w:r>
+        <w:rPr>
+          <w:rFonts w:ascii="TH SarabunPSK" w:hAnsi="TH SarabunPSK" w:cs="TH SarabunPSK"/>
+          <w:color w:val="0070C0"/>
+          <w:sz w:val="32"/>
+          <w:szCs w:val="32"/>
+        </w:rPr>
+        <w:t xml:space="preserve"> NVDIA GeForce RTX 2070 SUPER</w:t>
       </w:r>
     </w:p>
     <w:p>
@@ -1371,6 +1547,7 @@
         <w:ind w:left="360"/>
         <w:rPr>
           <w:rFonts w:ascii="TH SarabunPSK" w:hAnsi="TH SarabunPSK" w:cs="TH SarabunPSK"/>
+          <w:color w:val="0070C0"/>
           <w:sz w:val="32"/>
           <w:szCs w:val="32"/>
           <w:lang w:bidi="th-TH"/>
@@ -1378,13 +1555,96 @@
       </w:pPr>
       <w:r>
         <w:rPr>
-          <w:rFonts w:ascii="TH SarabunPSK" w:hAnsi="TH SarabunPSK" w:cs="TH SarabunPSK" w:hint="cs"/>
-          <w:sz w:val="32"/>
-          <w:szCs w:val="32"/>
-          <w:lang w:bidi="th-TH"/>
-        </w:rPr>
-        <w:t>___________________________________________________________________________________________________________________________________________________________________________________________________________________________________________________________________________________________________________________________________________________________________________________________________________</w:t>
+          <w:rFonts w:ascii="TH SarabunPSK" w:hAnsi="TH SarabunPSK" w:cs="TH SarabunPSK"/>
+          <w:color w:val="0070C0"/>
+          <w:sz w:val="32"/>
+          <w:szCs w:val="32"/>
+          <w:lang w:bidi="th-TH"/>
+        </w:rPr>
+        <w:t xml:space="preserve">Notepad++ </w:t>
       </w:r>
+    </w:p>
+    <w:p>
+      <w:pPr>
+        <w:pStyle w:val="ListParagraph"/>
+        <w:ind w:left="360"/>
+        <w:rPr>
+          <w:rFonts w:ascii="TH SarabunPSK" w:hAnsi="TH SarabunPSK" w:cs="TH SarabunPSK"/>
+          <w:color w:val="0070C0"/>
+          <w:sz w:val="32"/>
+          <w:szCs w:val="32"/>
+          <w:lang w:bidi="th-TH"/>
+        </w:rPr>
+      </w:pPr>
+      <w:r>
+        <w:rPr>
+          <w:rFonts w:ascii="TH SarabunPSK" w:hAnsi="TH SarabunPSK" w:cs="TH SarabunPSK"/>
+          <w:color w:val="0070C0"/>
+          <w:sz w:val="32"/>
+          <w:szCs w:val="32"/>
+          <w:lang w:bidi="th-TH"/>
+        </w:rPr>
+        <w:t>Command prompt</w:t>
+      </w:r>
+    </w:p>
+    <w:p>
+      <w:pPr>
+        <w:pStyle w:val="ListParagraph"/>
+        <w:ind w:left="360"/>
+        <w:rPr>
+          <w:rFonts w:ascii="TH SarabunPSK" w:hAnsi="TH SarabunPSK" w:cs="TH SarabunPSK"/>
+          <w:color w:val="0070C0"/>
+          <w:sz w:val="32"/>
+          <w:szCs w:val="32"/>
+          <w:lang w:bidi="th-TH"/>
+        </w:rPr>
+      </w:pPr>
+      <w:r>
+        <w:rPr>
+          <w:rFonts w:ascii="TH SarabunPSK" w:hAnsi="TH SarabunPSK" w:cs="TH SarabunPSK"/>
+          <w:color w:val="0070C0"/>
+          <w:sz w:val="32"/>
+          <w:szCs w:val="32"/>
+          <w:lang w:bidi="th-TH"/>
+        </w:rPr>
+        <w:t>Python</w:t>
+      </w:r>
+    </w:p>
+    <w:p>
+      <w:pPr>
+        <w:pStyle w:val="ListParagraph"/>
+        <w:ind w:left="360"/>
+        <w:rPr>
+          <w:rFonts w:ascii="TH SarabunPSK" w:hAnsi="TH SarabunPSK" w:cs="TH SarabunPSK"/>
+          <w:color w:val="0070C0"/>
+          <w:sz w:val="32"/>
+          <w:szCs w:val="32"/>
+          <w:lang w:bidi="th-TH"/>
+        </w:rPr>
+      </w:pPr>
+      <w:r>
+        <w:rPr>
+          <w:rFonts w:ascii="TH SarabunPSK" w:hAnsi="TH SarabunPSK" w:cs="TH SarabunPSK"/>
+          <w:color w:val="0070C0"/>
+          <w:sz w:val="32"/>
+          <w:szCs w:val="32"/>
+          <w:lang w:bidi="th-TH"/>
+        </w:rPr>
+        <w:t>Robot framework</w:t>
+      </w:r>
+    </w:p>
+    <w:p>
+      <w:pPr>
+        <w:pStyle w:val="ListParagraph"/>
+        <w:ind w:left="360"/>
+        <w:rPr>
+          <w:rFonts w:ascii="TH SarabunPSK" w:hAnsi="TH SarabunPSK" w:cs="TH SarabunPSK"/>
+          <w:color w:val="0070C0"/>
+          <w:sz w:val="32"/>
+          <w:szCs w:val="32"/>
+          <w:lang w:bidi="th-TH"/>
+        </w:rPr>
+      </w:pPr>
     </w:p>
     <w:p>
       <w:pPr>
@@ -1461,19 +1721,35 @@
         <w:ind w:left="360"/>
         <w:rPr>
           <w:rFonts w:ascii="TH SarabunPSK" w:hAnsi="TH SarabunPSK" w:cs="TH SarabunPSK"/>
-          <w:sz w:val="32"/>
-          <w:szCs w:val="32"/>
+          <w:color w:val="0070C0"/>
+          <w:sz w:val="32"/>
+          <w:szCs w:val="32"/>
+          <w:lang w:bidi="th-TH"/>
         </w:rPr>
       </w:pPr>
       <w:r>
         <w:rPr>
           <w:rFonts w:ascii="TH SarabunPSK" w:hAnsi="TH SarabunPSK" w:cs="TH SarabunPSK" w:hint="cs"/>
-          <w:sz w:val="32"/>
-          <w:szCs w:val="32"/>
-          <w:lang w:bidi="th-TH"/>
-        </w:rPr>
-        <w:t>_____________________________________________________________________________________________________________________________________________________________________________________________________________________________________________</w:t>
+          <w:color w:val="0070C0"/>
+          <w:sz w:val="32"/>
+          <w:szCs w:val="32"/>
+          <w:cs/>
+          <w:lang w:bidi="th-TH"/>
+        </w:rPr>
+        <w:t>นายตะวัน อุตมาน</w:t>
       </w:r>
+    </w:p>
+    <w:p>
+      <w:pPr>
+        <w:pStyle w:val="ListParagraph"/>
+        <w:ind w:left="360"/>
+        <w:rPr>
+          <w:rFonts w:ascii="TH SarabunPSK" w:hAnsi="TH SarabunPSK" w:cs="TH SarabunPSK"/>
+          <w:sz w:val="32"/>
+          <w:szCs w:val="32"/>
+          <w:lang w:bidi="th-TH"/>
+        </w:rPr>
+      </w:pPr>
     </w:p>
     <w:p>
       <w:pPr>
@@ -1919,7 +2195,7 @@
     <w:p>
       <w:pPr>
         <w:rPr>
-          <w:rFonts w:ascii="TH SarabunPSK" w:hAnsi="TH SarabunPSK" w:cs="TH SarabunPSK" w:hint="cs"/>
+          <w:rFonts w:ascii="TH SarabunPSK" w:hAnsi="TH SarabunPSK" w:cs="TH SarabunPSK"/>
           <w:sz w:val="32"/>
           <w:szCs w:val="32"/>
           <w:lang w:bidi="th-TH"/>
@@ -2275,17 +2551,7 @@
                 <w:cs/>
                 <w:lang w:bidi="th-TH"/>
               </w:rPr>
-              <w:t>อบรมเชิงปฏิบั</w:t>
-            </w:r>
-            <w:r>
-              <w:rPr>
-                <w:rFonts w:ascii="TH SarabunPSK" w:hAnsi="TH SarabunPSK" w:cs="TH SarabunPSK" w:hint="cs"/>
-                <w:sz w:val="32"/>
-                <w:szCs w:val="32"/>
-                <w:cs/>
-                <w:lang w:bidi="th-TH"/>
-              </w:rPr>
-              <w:t>ติการ</w:t>
+              <w:t>อบรมเชิงปฏิบัติการ</w:t>
             </w:r>
             <w:r>
               <w:rPr>
@@ -2348,11 +2614,23 @@
             <w:pPr>
               <w:rPr>
                 <w:rFonts w:ascii="TH SarabunPSK" w:hAnsi="TH SarabunPSK" w:cs="TH SarabunPSK"/>
-                <w:sz w:val="32"/>
-                <w:szCs w:val="32"/>
-                <w:lang w:bidi="th-TH"/>
-              </w:rPr>
-            </w:pPr>
+                <w:color w:val="0070C0"/>
+                <w:sz w:val="32"/>
+                <w:szCs w:val="32"/>
+                <w:lang w:bidi="th-TH"/>
+              </w:rPr>
+            </w:pPr>
+            <w:r>
+              <w:rPr>
+                <w:rFonts w:ascii="TH SarabunPSK" w:hAnsi="TH SarabunPSK" w:cs="TH SarabunPSK" w:hint="cs"/>
+                <w:color w:val="0070C0"/>
+                <w:sz w:val="32"/>
+                <w:szCs w:val="32"/>
+                <w:cs/>
+                <w:lang w:bidi="th-TH"/>
+              </w:rPr>
+              <w:t>นายตะวัน อุตมาน</w:t>
+            </w:r>
           </w:p>
         </w:tc>
       </w:tr>
@@ -2717,6 +2995,16 @@
                 <w:lang w:bidi="th-TH"/>
               </w:rPr>
             </w:pPr>
+            <w:r>
+              <w:rPr>
+                <w:rFonts w:ascii="TH SarabunPSK" w:hAnsi="TH SarabunPSK" w:cs="TH SarabunPSK"/>
+                <w:color w:val="0070C0"/>
+                <w:sz w:val="32"/>
+                <w:szCs w:val="32"/>
+                <w:lang w:bidi="th-TH"/>
+              </w:rPr>
+              <w:t>24/12/2568</w:t>
+            </w:r>
           </w:p>
         </w:tc>
       </w:tr>
@@ -4675,6 +4963,7 @@
               </w:rPr>
               <w:t>“</w:t>
             </w:r>
+            <w:bookmarkStart w:id="0" w:name="_GoBack"/>
             <w:r>
               <w:rPr>
                 <w:rFonts w:ascii="TH SarabunPSK" w:hAnsi="TH SarabunPSK" w:cs="TH SarabunPSK"/>
@@ -4702,6 +4991,7 @@
               </w:rPr>
               <w:t>.</w:t>
             </w:r>
+            <w:bookmarkEnd w:id="0"/>
             <w:r>
               <w:rPr>
                 <w:rFonts w:ascii="TH SarabunPSK" w:hAnsi="TH SarabunPSK" w:cs="TH SarabunPSK" w:hint="cs"/>
@@ -6424,17 +6714,7 @@
                 <w:cs/>
                 <w:lang w:bidi="th-TH"/>
               </w:rPr>
-              <w:t>ลงทะเบียนเข้า</w:t>
-            </w:r>
-            <w:r>
-              <w:rPr>
-                <w:rFonts w:ascii="TH SarabunPSK" w:hAnsi="TH SarabunPSK" w:cs="TH SarabunPSK" w:hint="cs"/>
-                <w:sz w:val="32"/>
-                <w:szCs w:val="32"/>
-                <w:cs/>
-                <w:lang w:bidi="th-TH"/>
-              </w:rPr>
-              <w:t>ร่วม</w:t>
+              <w:t>ลงทะเบียนเข้าร่วม</w:t>
             </w:r>
             <w:r>
               <w:rPr>
@@ -6525,6 +6805,17 @@
                 <w:lang w:bidi="th-TH"/>
               </w:rPr>
             </w:pPr>
+            <w:r>
+              <w:rPr>
+                <w:rFonts w:ascii="TH SarabunPSK" w:hAnsi="TH SarabunPSK" w:cs="TH SarabunPSK" w:hint="cs"/>
+                <w:color w:val="0070C0"/>
+                <w:sz w:val="32"/>
+                <w:szCs w:val="32"/>
+                <w:cs/>
+                <w:lang w:bidi="th-TH"/>
+              </w:rPr>
+              <w:t>นายตะวัน อุตมาน</w:t>
+            </w:r>
           </w:p>
         </w:tc>
       </w:tr>
@@ -6554,29 +6845,7 @@
                 <w:szCs w:val="32"/>
                 <w:lang w:bidi="th-TH"/>
               </w:rPr>
-              <w:t>U</w:t>
-            </w:r>
-            <w:r>
-              <w:rPr>
-                <w:rFonts w:ascii="TH SarabunPSK" w:hAnsi="TH SarabunPSK" w:cs="TH SarabunPSK" w:hint="cs"/>
-                <w:b/>
-                <w:bCs/>
-                <w:sz w:val="32"/>
-                <w:szCs w:val="32"/>
-                <w:lang w:bidi="th-TH"/>
-              </w:rPr>
-              <w:t>A</w:t>
-            </w:r>
-            <w:r>
-              <w:rPr>
-                <w:rFonts w:ascii="TH SarabunPSK" w:hAnsi="TH SarabunPSK" w:cs="TH SarabunPSK" w:hint="cs"/>
-                <w:b/>
-                <w:bCs/>
-                <w:sz w:val="32"/>
-                <w:szCs w:val="32"/>
-                <w:lang w:bidi="th-TH"/>
-              </w:rPr>
-              <w:t>T Name</w:t>
+              <w:t>UAT Name</w:t>
             </w:r>
             <w:r>
               <w:rPr>
@@ -6889,6 +7158,16 @@
                 <w:lang w:bidi="th-TH"/>
               </w:rPr>
             </w:pPr>
+            <w:r>
+              <w:rPr>
+                <w:rFonts w:ascii="TH SarabunPSK" w:hAnsi="TH SarabunPSK" w:cs="TH SarabunPSK"/>
+                <w:color w:val="0070C0"/>
+                <w:sz w:val="32"/>
+                <w:szCs w:val="32"/>
+                <w:lang w:bidi="th-TH"/>
+              </w:rPr>
+              <w:t>24/12/2568</w:t>
+            </w:r>
           </w:p>
         </w:tc>
       </w:tr>
@@ -14944,7 +15223,7 @@
 </file>
 
 <file path=word/endnotes.xml><?xml version="1.0" encoding="utf-8"?>
-<w:endnotes xmlns:wpc="http://schemas.microsoft.com/office/word/2010/wordprocessingCanvas" xmlns:cx="http://schemas.microsoft.com/office/drawing/2014/chartex" xmlns:cx1="http://schemas.microsoft.com/office/drawing/2015/9/8/chartex" xmlns:cx2="http://schemas.microsoft.com/office/drawing/2015/10/21/chartex" xmlns:cx3="http://schemas.microsoft.com/office/drawing/2016/5/9/chartex" xmlns:cx4="http://schemas.microsoft.com/office/drawing/2016/5/10/chartex" xmlns:cx5="http://schemas.microsoft.com/office/drawing/2016/5/11/chartex" xmlns:cx6="http://schemas.microsoft.com/office/drawing/2016/5/12/chartex" xmlns:cx7="http://schemas.microsoft.com/office/drawing/2016/5/13/chartex" xmlns:cx8="http://schemas.microsoft.com/office/drawing/2016/5/14/chartex" xmlns:mc="http://schemas.openxmlformats.org/markup-compatibility/2006" xmlns:aink="http://schemas.microsoft.com/office/drawing/2016/ink" xmlns:am3d="http://schemas.microsoft.com/office/drawing/2017/model3d" xmlns:o="urn:schemas-microsoft-com:office:office" xmlns:oel="http://schemas.microsoft.com/office/2019/extlst" xmlns:r="http://schemas.openxmlformats.org/officeDocument/2006/relationships" xmlns:m="http://schemas.openxmlformats.org/officeDocument/2006/math" xmlns:v="urn:schemas-microsoft-com:vml" xmlns:wp14="http://schemas.microsoft.com/office/word/2010/wordprocessingDrawing" xmlns:wp="http://schemas.openxmlformats.org/drawingml/2006/wordprocessingDrawing" xmlns:w10="urn:schemas-microsoft-com:office:word" xmlns:w="http://schemas.openxmlformats.org/wordprocessingml/2006/main" xmlns:w14="http://schemas.microsoft.com/office/word/2010/wordml" xmlns:w15="http://schemas.microsoft.com/office/word/2012/wordml" xmlns:w16cex="http://schemas.microsoft.com/office/word/2018/wordml/cex" xmlns:w16cid="http://schemas.microsoft.com/office/word/2016/wordml/cid" xmlns:w16="http://schemas.microsoft.com/office/word/2018/wordml" xmlns:w16du="http://schemas.microsoft.com/office/word/2023/wordml/word16du" xmlns:w16sdtdh="http://schemas.microsoft.com/office/word/2020/wordml/sdtdatahash" xmlns:w16sdtfl="http://schemas.microsoft.com/office/word/2024/wordml/sdtformatlock" xmlns:w16se="http://schemas.microsoft.com/office/word/2015/wordml/symex" xmlns:wpg="http://schemas.microsoft.com/office/word/2010/wordprocessingGroup" xmlns:wpi="http://schemas.microsoft.com/office/word/2010/wordprocessingInk" xmlns:wne="http://schemas.microsoft.com/office/word/2006/wordml" xmlns:wps="http://schemas.microsoft.com/office/word/2010/wordprocessingShape" mc:Ignorable="w14 w15 w16se w16cid w16 w16cex w16sdtdh w16sdtfl w16du wp14">
+<w:endnotes xmlns:wpc="http://schemas.microsoft.com/office/word/2010/wordprocessingCanvas" xmlns:cx="http://schemas.microsoft.com/office/drawing/2014/chartex" xmlns:cx1="http://schemas.microsoft.com/office/drawing/2015/9/8/chartex" xmlns:cx2="http://schemas.microsoft.com/office/drawing/2015/10/21/chartex" xmlns:cx3="http://schemas.microsoft.com/office/drawing/2016/5/9/chartex" xmlns:cx4="http://schemas.microsoft.com/office/drawing/2016/5/10/chartex" xmlns:cx5="http://schemas.microsoft.com/office/drawing/2016/5/11/chartex" xmlns:cx6="http://schemas.microsoft.com/office/drawing/2016/5/12/chartex" xmlns:cx7="http://schemas.microsoft.com/office/drawing/2016/5/13/chartex" xmlns:cx8="http://schemas.microsoft.com/office/drawing/2016/5/14/chartex" xmlns:mc="http://schemas.openxmlformats.org/markup-compatibility/2006" xmlns:aink="http://schemas.microsoft.com/office/drawing/2016/ink" xmlns:am3d="http://schemas.microsoft.com/office/drawing/2017/model3d" xmlns:o="urn:schemas-microsoft-com:office:office" xmlns:r="http://schemas.openxmlformats.org/officeDocument/2006/relationships" xmlns:m="http://schemas.openxmlformats.org/officeDocument/2006/math" xmlns:v="urn:schemas-microsoft-com:vml" xmlns:wp14="http://schemas.microsoft.com/office/word/2010/wordprocessingDrawing" xmlns:wp="http://schemas.openxmlformats.org/drawingml/2006/wordprocessingDrawing" xmlns:w10="urn:schemas-microsoft-com:office:word" xmlns:w="http://schemas.openxmlformats.org/wordprocessingml/2006/main" xmlns:w14="http://schemas.microsoft.com/office/word/2010/wordml" xmlns:w15="http://schemas.microsoft.com/office/word/2012/wordml" xmlns:w16cid="http://schemas.microsoft.com/office/word/2016/wordml/cid" xmlns:w16se="http://schemas.microsoft.com/office/word/2015/wordml/symex" xmlns:wpg="http://schemas.microsoft.com/office/word/2010/wordprocessingGroup" xmlns:wpi="http://schemas.microsoft.com/office/word/2010/wordprocessingInk" xmlns:wne="http://schemas.microsoft.com/office/word/2006/wordml" xmlns:wps="http://schemas.microsoft.com/office/word/2010/wordprocessingShape" mc:Ignorable="w14 w15 w16se w16cid wp14">
   <w:endnote w:type="separator" w:id="-1">
     <w:p>
       <w:pPr>
@@ -14969,7 +15248,7 @@
 </file>
 
 <file path=word/footnotes.xml><?xml version="1.0" encoding="utf-8"?>
-<w:footnotes xmlns:wpc="http://schemas.microsoft.com/office/word/2010/wordprocessingCanvas" xmlns:cx="http://schemas.microsoft.com/office/drawing/2014/chartex" xmlns:cx1="http://schemas.microsoft.com/office/drawing/2015/9/8/chartex" xmlns:cx2="http://schemas.microsoft.com/office/drawing/2015/10/21/chartex" xmlns:cx3="http://schemas.microsoft.com/office/drawing/2016/5/9/chartex" xmlns:cx4="http://schemas.microsoft.com/office/drawing/2016/5/10/chartex" xmlns:cx5="http://schemas.microsoft.com/office/drawing/2016/5/11/chartex" xmlns:cx6="http://schemas.microsoft.com/office/drawing/2016/5/12/chartex" xmlns:cx7="http://schemas.microsoft.com/office/drawing/2016/5/13/chartex" xmlns:cx8="http://schemas.microsoft.com/office/drawing/2016/5/14/chartex" xmlns:mc="http://schemas.openxmlformats.org/markup-compatibility/2006" xmlns:aink="http://schemas.microsoft.com/office/drawing/2016/ink" xmlns:am3d="http://schemas.microsoft.com/office/drawing/2017/model3d" xmlns:o="urn:schemas-microsoft-com:office:office" xmlns:oel="http://schemas.microsoft.com/office/2019/extlst" xmlns:r="http://schemas.openxmlformats.org/officeDocument/2006/relationships" xmlns:m="http://schemas.openxmlformats.org/officeDocument/2006/math" xmlns:v="urn:schemas-microsoft-com:vml" xmlns:wp14="http://schemas.microsoft.com/office/word/2010/wordprocessingDrawing" xmlns:wp="http://schemas.openxmlformats.org/drawingml/2006/wordprocessingDrawing" xmlns:w10="urn:schemas-microsoft-com:office:word" xmlns:w="http://schemas.openxmlformats.org/wordprocessingml/2006/main" xmlns:w14="http://schemas.microsoft.com/office/word/2010/wordml" xmlns:w15="http://schemas.microsoft.com/office/word/2012/wordml" xmlns:w16cex="http://schemas.microsoft.com/office/word/2018/wordml/cex" xmlns:w16cid="http://schemas.microsoft.com/office/word/2016/wordml/cid" xmlns:w16="http://schemas.microsoft.com/office/word/2018/wordml" xmlns:w16du="http://schemas.microsoft.com/office/word/2023/wordml/word16du" xmlns:w16sdtdh="http://schemas.microsoft.com/office/word/2020/wordml/sdtdatahash" xmlns:w16sdtfl="http://schemas.microsoft.com/office/word/2024/wordml/sdtformatlock" xmlns:w16se="http://schemas.microsoft.com/office/word/2015/wordml/symex" xmlns:wpg="http://schemas.microsoft.com/office/word/2010/wordprocessingGroup" xmlns:wpi="http://schemas.microsoft.com/office/word/2010/wordprocessingInk" xmlns:wne="http://schemas.microsoft.com/office/word/2006/wordml" xmlns:wps="http://schemas.microsoft.com/office/word/2010/wordprocessingShape" mc:Ignorable="w14 w15 w16se w16cid w16 w16cex w16sdtdh w16sdtfl w16du wp14">
+<w:footnotes xmlns:wpc="http://schemas.microsoft.com/office/word/2010/wordprocessingCanvas" xmlns:cx="http://schemas.microsoft.com/office/drawing/2014/chartex" xmlns:cx1="http://schemas.microsoft.com/office/drawing/2015/9/8/chartex" xmlns:cx2="http://schemas.microsoft.com/office/drawing/2015/10/21/chartex" xmlns:cx3="http://schemas.microsoft.com/office/drawing/2016/5/9/chartex" xmlns:cx4="http://schemas.microsoft.com/office/drawing/2016/5/10/chartex" xmlns:cx5="http://schemas.microsoft.com/office/drawing/2016/5/11/chartex" xmlns:cx6="http://schemas.microsoft.com/office/drawing/2016/5/12/chartex" xmlns:cx7="http://schemas.microsoft.com/office/drawing/2016/5/13/chartex" xmlns:cx8="http://schemas.microsoft.com/office/drawing/2016/5/14/chartex" xmlns:mc="http://schemas.openxmlformats.org/markup-compatibility/2006" xmlns:aink="http://schemas.microsoft.com/office/drawing/2016/ink" xmlns:am3d="http://schemas.microsoft.com/office/drawing/2017/model3d" xmlns:o="urn:schemas-microsoft-com:office:office" xmlns:r="http://schemas.openxmlformats.org/officeDocument/2006/relationships" xmlns:m="http://schemas.openxmlformats.org/officeDocument/2006/math" xmlns:v="urn:schemas-microsoft-com:vml" xmlns:wp14="http://schemas.microsoft.com/office/word/2010/wordprocessingDrawing" xmlns:wp="http://schemas.openxmlformats.org/drawingml/2006/wordprocessingDrawing" xmlns:w10="urn:schemas-microsoft-com:office:word" xmlns:w="http://schemas.openxmlformats.org/wordprocessingml/2006/main" xmlns:w14="http://schemas.microsoft.com/office/word/2010/wordml" xmlns:w15="http://schemas.microsoft.com/office/word/2012/wordml" xmlns:w16cid="http://schemas.microsoft.com/office/word/2016/wordml/cid" xmlns:w16se="http://schemas.microsoft.com/office/word/2015/wordml/symex" xmlns:wpg="http://schemas.microsoft.com/office/word/2010/wordprocessingGroup" xmlns:wpi="http://schemas.microsoft.com/office/word/2010/wordprocessingInk" xmlns:wne="http://schemas.microsoft.com/office/word/2006/wordml" xmlns:wps="http://schemas.microsoft.com/office/word/2010/wordprocessingShape" mc:Ignorable="w14 w15 w16se w16cid wp14">
   <w:footnote w:type="separator" w:id="-1">
     <w:p>
       <w:pPr>
@@ -14994,7 +15273,7 @@
 </file>
 
 <file path=word/header1.xml><?xml version="1.0" encoding="utf-8"?>
-<w:hdr xmlns:wpc="http://schemas.microsoft.com/office/word/2010/wordprocessingCanvas" xmlns:cx="http://schemas.microsoft.com/office/drawing/2014/chartex" xmlns:cx1="http://schemas.microsoft.com/office/drawing/2015/9/8/chartex" xmlns:cx2="http://schemas.microsoft.com/office/drawing/2015/10/21/chartex" xmlns:cx3="http://schemas.microsoft.com/office/drawing/2016/5/9/chartex" xmlns:cx4="http://schemas.microsoft.com/office/drawing/2016/5/10/chartex" xmlns:cx5="http://schemas.microsoft.com/office/drawing/2016/5/11/chartex" xmlns:cx6="http://schemas.microsoft.com/office/drawing/2016/5/12/chartex" xmlns:cx7="http://schemas.microsoft.com/office/drawing/2016/5/13/chartex" xmlns:cx8="http://schemas.microsoft.com/office/drawing/2016/5/14/chartex" xmlns:mc="http://schemas.openxmlformats.org/markup-compatibility/2006" xmlns:aink="http://schemas.microsoft.com/office/drawing/2016/ink" xmlns:am3d="http://schemas.microsoft.com/office/drawing/2017/model3d" xmlns:o="urn:schemas-microsoft-com:office:office" xmlns:oel="http://schemas.microsoft.com/office/2019/extlst" xmlns:r="http://schemas.openxmlformats.org/officeDocument/2006/relationships" xmlns:m="http://schemas.openxmlformats.org/officeDocument/2006/math" xmlns:v="urn:schemas-microsoft-com:vml" xmlns:wp14="http://schemas.microsoft.com/office/word/2010/wordprocessingDrawing" xmlns:wp="http://schemas.openxmlformats.org/drawingml/2006/wordprocessingDrawing" xmlns:w10="urn:schemas-microsoft-com:office:word" xmlns:w="http://schemas.openxmlformats.org/wordprocessingml/2006/main" xmlns:w14="http://schemas.microsoft.com/office/word/2010/wordml" xmlns:w15="http://schemas.microsoft.com/office/word/2012/wordml" xmlns:w16cex="http://schemas.microsoft.com/office/word/2018/wordml/cex" xmlns:w16cid="http://schemas.microsoft.com/office/word/2016/wordml/cid" xmlns:w16="http://schemas.microsoft.com/office/word/2018/wordml" xmlns:w16du="http://schemas.microsoft.com/office/word/2023/wordml/word16du" xmlns:w16sdtdh="http://schemas.microsoft.com/office/word/2020/wordml/sdtdatahash" xmlns:w16sdtfl="http://schemas.microsoft.com/office/word/2024/wordml/sdtformatlock" xmlns:w16se="http://schemas.microsoft.com/office/word/2015/wordml/symex" xmlns:wpg="http://schemas.microsoft.com/office/word/2010/wordprocessingGroup" xmlns:wpi="http://schemas.microsoft.com/office/word/2010/wordprocessingInk" xmlns:wne="http://schemas.microsoft.com/office/word/2006/wordml" xmlns:wps="http://schemas.microsoft.com/office/word/2010/wordprocessingShape" mc:Ignorable="w14 w15 w16se w16cid w16 w16cex w16sdtdh w16sdtfl w16du wp14">
+<w:hdr xmlns:wpc="http://schemas.microsoft.com/office/word/2010/wordprocessingCanvas" xmlns:cx="http://schemas.microsoft.com/office/drawing/2014/chartex" xmlns:cx1="http://schemas.microsoft.com/office/drawing/2015/9/8/chartex" xmlns:cx2="http://schemas.microsoft.com/office/drawing/2015/10/21/chartex" xmlns:cx3="http://schemas.microsoft.com/office/drawing/2016/5/9/chartex" xmlns:cx4="http://schemas.microsoft.com/office/drawing/2016/5/10/chartex" xmlns:cx5="http://schemas.microsoft.com/office/drawing/2016/5/11/chartex" xmlns:cx6="http://schemas.microsoft.com/office/drawing/2016/5/12/chartex" xmlns:cx7="http://schemas.microsoft.com/office/drawing/2016/5/13/chartex" xmlns:cx8="http://schemas.microsoft.com/office/drawing/2016/5/14/chartex" xmlns:mc="http://schemas.openxmlformats.org/markup-compatibility/2006" xmlns:aink="http://schemas.microsoft.com/office/drawing/2016/ink" xmlns:am3d="http://schemas.microsoft.com/office/drawing/2017/model3d" xmlns:o="urn:schemas-microsoft-com:office:office" xmlns:r="http://schemas.openxmlformats.org/officeDocument/2006/relationships" xmlns:m="http://schemas.openxmlformats.org/officeDocument/2006/math" xmlns:v="urn:schemas-microsoft-com:vml" xmlns:wp14="http://schemas.microsoft.com/office/word/2010/wordprocessingDrawing" xmlns:wp="http://schemas.openxmlformats.org/drawingml/2006/wordprocessingDrawing" xmlns:w10="urn:schemas-microsoft-com:office:word" xmlns:w="http://schemas.openxmlformats.org/wordprocessingml/2006/main" xmlns:w14="http://schemas.microsoft.com/office/word/2010/wordml" xmlns:w15="http://schemas.microsoft.com/office/word/2012/wordml" xmlns:w16cid="http://schemas.microsoft.com/office/word/2016/wordml/cid" xmlns:w16se="http://schemas.microsoft.com/office/word/2015/wordml/symex" xmlns:wpg="http://schemas.microsoft.com/office/word/2010/wordprocessingGroup" xmlns:wpi="http://schemas.microsoft.com/office/word/2010/wordprocessingInk" xmlns:wne="http://schemas.microsoft.com/office/word/2006/wordml" xmlns:wps="http://schemas.microsoft.com/office/word/2010/wordprocessingShape" mc:Ignorable="w14 w15 w16se w16cid wp14">
   <w:p>
     <w:pPr>
       <w:pStyle w:val="Header"/>
@@ -15335,7 +15614,7 @@
 </file>
 
 <file path=word/numbering.xml><?xml version="1.0" encoding="utf-8"?>
-<w:numbering xmlns:wpc="http://schemas.microsoft.com/office/word/2010/wordprocessingCanvas" xmlns:cx="http://schemas.microsoft.com/office/drawing/2014/chartex" xmlns:cx1="http://schemas.microsoft.com/office/drawing/2015/9/8/chartex" xmlns:cx2="http://schemas.microsoft.com/office/drawing/2015/10/21/chartex" xmlns:cx3="http://schemas.microsoft.com/office/drawing/2016/5/9/chartex" xmlns:cx4="http://schemas.microsoft.com/office/drawing/2016/5/10/chartex" xmlns:cx5="http://schemas.microsoft.com/office/drawing/2016/5/11/chartex" xmlns:cx6="http://schemas.microsoft.com/office/drawing/2016/5/12/chartex" xmlns:cx7="http://schemas.microsoft.com/office/drawing/2016/5/13/chartex" xmlns:cx8="http://schemas.microsoft.com/office/drawing/2016/5/14/chartex" xmlns:mc="http://schemas.openxmlformats.org/markup-compatibility/2006" xmlns:aink="http://schemas.microsoft.com/office/drawing/2016/ink" xmlns:am3d="http://schemas.microsoft.com/office/drawing/2017/model3d" xmlns:o="urn:schemas-microsoft-com:office:office" xmlns:oel="http://schemas.microsoft.com/office/2019/extlst" xmlns:r="http://schemas.openxmlformats.org/officeDocument/2006/relationships" xmlns:m="http://schemas.openxmlformats.org/officeDocument/2006/math" xmlns:v="urn:schemas-microsoft-com:vml" xmlns:wp14="http://schemas.microsoft.com/office/word/2010/wordprocessingDrawing" xmlns:wp="http://schemas.openxmlformats.org/drawingml/2006/wordprocessingDrawing" xmlns:w10="urn:schemas-microsoft-com:office:word" xmlns:w="http://schemas.openxmlformats.org/wordprocessingml/2006/main" xmlns:w14="http://schemas.microsoft.com/office/word/2010/wordml" xmlns:w15="http://schemas.microsoft.com/office/word/2012/wordml" xmlns:w16cex="http://schemas.microsoft.com/office/word/2018/wordml/cex" xmlns:w16cid="http://schemas.microsoft.com/office/word/2016/wordml/cid" xmlns:w16="http://schemas.microsoft.com/office/word/2018/wordml" xmlns:w16du="http://schemas.microsoft.com/office/word/2023/wordml/word16du" xmlns:w16sdtdh="http://schemas.microsoft.com/office/word/2020/wordml/sdtdatahash" xmlns:w16sdtfl="http://schemas.microsoft.com/office/word/2024/wordml/sdtformatlock" xmlns:w16se="http://schemas.microsoft.com/office/word/2015/wordml/symex" xmlns:wpg="http://schemas.microsoft.com/office/word/2010/wordprocessingGroup" xmlns:wpi="http://schemas.microsoft.com/office/word/2010/wordprocessingInk" xmlns:wne="http://schemas.microsoft.com/office/word/2006/wordml" xmlns:wps="http://schemas.microsoft.com/office/word/2010/wordprocessingShape" mc:Ignorable="w14 w15 w16se w16cid w16 w16cex w16sdtdh w16sdtfl w16du wp14">
+<w:numbering xmlns:wpc="http://schemas.microsoft.com/office/word/2010/wordprocessingCanvas" xmlns:cx="http://schemas.microsoft.com/office/drawing/2014/chartex" xmlns:cx1="http://schemas.microsoft.com/office/drawing/2015/9/8/chartex" xmlns:cx2="http://schemas.microsoft.com/office/drawing/2015/10/21/chartex" xmlns:cx3="http://schemas.microsoft.com/office/drawing/2016/5/9/chartex" xmlns:cx4="http://schemas.microsoft.com/office/drawing/2016/5/10/chartex" xmlns:cx5="http://schemas.microsoft.com/office/drawing/2016/5/11/chartex" xmlns:cx6="http://schemas.microsoft.com/office/drawing/2016/5/12/chartex" xmlns:cx7="http://schemas.microsoft.com/office/drawing/2016/5/13/chartex" xmlns:cx8="http://schemas.microsoft.com/office/drawing/2016/5/14/chartex" xmlns:mc="http://schemas.openxmlformats.org/markup-compatibility/2006" xmlns:aink="http://schemas.microsoft.com/office/drawing/2016/ink" xmlns:am3d="http://schemas.microsoft.com/office/drawing/2017/model3d" xmlns:o="urn:schemas-microsoft-com:office:office" xmlns:r="http://schemas.openxmlformats.org/officeDocument/2006/relationships" xmlns:m="http://schemas.openxmlformats.org/officeDocument/2006/math" xmlns:v="urn:schemas-microsoft-com:vml" xmlns:wp14="http://schemas.microsoft.com/office/word/2010/wordprocessingDrawing" xmlns:wp="http://schemas.openxmlformats.org/drawingml/2006/wordprocessingDrawing" xmlns:w10="urn:schemas-microsoft-com:office:word" xmlns:w="http://schemas.openxmlformats.org/wordprocessingml/2006/main" xmlns:w14="http://schemas.microsoft.com/office/word/2010/wordml" xmlns:w15="http://schemas.microsoft.com/office/word/2012/wordml" xmlns:w16cid="http://schemas.microsoft.com/office/word/2016/wordml/cid" xmlns:w16se="http://schemas.microsoft.com/office/word/2015/wordml/symex" xmlns:wpg="http://schemas.microsoft.com/office/word/2010/wordprocessingGroup" xmlns:wpi="http://schemas.microsoft.com/office/word/2010/wordprocessingInk" xmlns:wne="http://schemas.microsoft.com/office/word/2006/wordml" xmlns:wps="http://schemas.microsoft.com/office/word/2010/wordprocessingShape" mc:Ignorable="w14 w15 w16se w16cid wp14">
   <w:abstractNum w:abstractNumId="0" w15:restartNumberingAfterBreak="0">
     <w:nsid w:val="1B567B81"/>
     <w:multiLevelType w:val="multilevel"/>
@@ -16963,65 +17242,65 @@
       </w:pPr>
     </w:lvl>
   </w:abstractNum>
-  <w:num w:numId="1" w16cid:durableId="663629780">
+  <w:num w:numId="1">
     <w:abstractNumId w:val="16"/>
   </w:num>
-  <w:num w:numId="2" w16cid:durableId="581136962">
+  <w:num w:numId="2">
     <w:abstractNumId w:val="0"/>
   </w:num>
-  <w:num w:numId="3" w16cid:durableId="770131056">
+  <w:num w:numId="3">
     <w:abstractNumId w:val="6"/>
   </w:num>
-  <w:num w:numId="4" w16cid:durableId="1682275086">
+  <w:num w:numId="4">
     <w:abstractNumId w:val="10"/>
   </w:num>
-  <w:num w:numId="5" w16cid:durableId="1573270202">
+  <w:num w:numId="5">
     <w:abstractNumId w:val="1"/>
   </w:num>
-  <w:num w:numId="6" w16cid:durableId="954798757">
+  <w:num w:numId="6">
     <w:abstractNumId w:val="17"/>
   </w:num>
-  <w:num w:numId="7" w16cid:durableId="859584482">
+  <w:num w:numId="7">
     <w:abstractNumId w:val="14"/>
   </w:num>
-  <w:num w:numId="8" w16cid:durableId="1137450962">
+  <w:num w:numId="8">
     <w:abstractNumId w:val="7"/>
   </w:num>
-  <w:num w:numId="9" w16cid:durableId="694117963">
+  <w:num w:numId="9">
     <w:abstractNumId w:val="15"/>
   </w:num>
-  <w:num w:numId="10" w16cid:durableId="1718355521">
+  <w:num w:numId="10">
     <w:abstractNumId w:val="8"/>
   </w:num>
-  <w:num w:numId="11" w16cid:durableId="1031494071">
+  <w:num w:numId="11">
     <w:abstractNumId w:val="4"/>
   </w:num>
-  <w:num w:numId="12" w16cid:durableId="319697078">
+  <w:num w:numId="12">
     <w:abstractNumId w:val="3"/>
   </w:num>
-  <w:num w:numId="13" w16cid:durableId="1330596765">
+  <w:num w:numId="13">
     <w:abstractNumId w:val="12"/>
   </w:num>
-  <w:num w:numId="14" w16cid:durableId="1726949968">
+  <w:num w:numId="14">
     <w:abstractNumId w:val="2"/>
   </w:num>
-  <w:num w:numId="15" w16cid:durableId="1660890394">
+  <w:num w:numId="15">
     <w:abstractNumId w:val="9"/>
   </w:num>
-  <w:num w:numId="16" w16cid:durableId="1478644557">
+  <w:num w:numId="16">
     <w:abstractNumId w:val="5"/>
   </w:num>
-  <w:num w:numId="17" w16cid:durableId="678896133">
+  <w:num w:numId="17">
     <w:abstractNumId w:val="11"/>
   </w:num>
-  <w:num w:numId="18" w16cid:durableId="12151334">
+  <w:num w:numId="18">
     <w:abstractNumId w:val="13"/>
   </w:num>
 </w:numbering>
 </file>
 
 <file path=word/styles.xml><?xml version="1.0" encoding="utf-8"?>
-<w:styles xmlns:mc="http://schemas.openxmlformats.org/markup-compatibility/2006" xmlns:r="http://schemas.openxmlformats.org/officeDocument/2006/relationships" xmlns:w="http://schemas.openxmlformats.org/wordprocessingml/2006/main" xmlns:w14="http://schemas.microsoft.com/office/word/2010/wordml" xmlns:w15="http://schemas.microsoft.com/office/word/2012/wordml" xmlns:w16cex="http://schemas.microsoft.com/office/word/2018/wordml/cex" xmlns:w16cid="http://schemas.microsoft.com/office/word/2016/wordml/cid" xmlns:w16="http://schemas.microsoft.com/office/word/2018/wordml" xmlns:w16du="http://schemas.microsoft.com/office/word/2023/wordml/word16du" xmlns:w16sdtdh="http://schemas.microsoft.com/office/word/2020/wordml/sdtdatahash" xmlns:w16sdtfl="http://schemas.microsoft.com/office/word/2024/wordml/sdtformatlock" xmlns:w16se="http://schemas.microsoft.com/office/word/2015/wordml/symex" mc:Ignorable="w14 w15 w16se w16cid w16 w16cex w16sdtdh w16sdtfl w16du">
+<w:styles xmlns:mc="http://schemas.openxmlformats.org/markup-compatibility/2006" xmlns:r="http://schemas.openxmlformats.org/officeDocument/2006/relationships" xmlns:w="http://schemas.openxmlformats.org/wordprocessingml/2006/main" xmlns:w14="http://schemas.microsoft.com/office/word/2010/wordml" xmlns:w15="http://schemas.microsoft.com/office/word/2012/wordml" xmlns:w16cid="http://schemas.microsoft.com/office/word/2016/wordml/cid" xmlns:w16se="http://schemas.microsoft.com/office/word/2015/wordml/symex" mc:Ignorable="w14 w15 w16se w16cid">
   <w:docDefaults>
     <w:rPrDefault>
       <w:rPr>
@@ -17037,7 +17316,7 @@
       </w:pPr>
     </w:pPrDefault>
   </w:docDefaults>
-  <w:latentStyles w:defLockedState="0" w:defUIPriority="99" w:defSemiHidden="0" w:defUnhideWhenUsed="0" w:defQFormat="0" w:count="376">
+  <w:latentStyles w:defLockedState="0" w:defUIPriority="99" w:defSemiHidden="0" w:defUnhideWhenUsed="0" w:defQFormat="0" w:count="375">
     <w:lsdException w:name="Normal" w:uiPriority="0" w:qFormat="1"/>
     <w:lsdException w:name="heading 1" w:uiPriority="9" w:qFormat="1"/>
     <w:lsdException w:name="heading 2" w:semiHidden="1" w:uiPriority="9" w:unhideWhenUsed="1" w:qFormat="1"/>
@@ -17413,7 +17692,6 @@
     <w:lsdException w:name="Smart Hyperlink" w:semiHidden="1" w:unhideWhenUsed="1"/>
     <w:lsdException w:name="Hashtag" w:semiHidden="1" w:unhideWhenUsed="1"/>
     <w:lsdException w:name="Unresolved Mention" w:semiHidden="1" w:unhideWhenUsed="1"/>
-    <w:lsdException w:name="Smart Link" w:semiHidden="1" w:unhideWhenUsed="1"/>
   </w:latentStyles>
   <w:style w:type="paragraph" w:default="1" w:styleId="Normal">
     <w:name w:val="Normal"/>
@@ -17800,7 +18078,7 @@
 </file>
 
 <file path=customXml/itemProps1.xml><?xml version="1.0" encoding="utf-8"?>
-<ds:datastoreItem xmlns:ds="http://schemas.openxmlformats.org/officeDocument/2006/customXml" ds:itemID="{FC8D8C52-9380-4951-9043-F266A1659D65}">
+<ds:datastoreItem xmlns:ds="http://schemas.openxmlformats.org/officeDocument/2006/customXml" ds:itemID="{A5B8FA97-AE61-4916-A964-E2B12D9055A9}">
   <ds:schemaRefs>
     <ds:schemaRef ds:uri="http://schemas.openxmlformats.org/officeDocument/2006/bibliography"/>
   </ds:schemaRefs>

</xml_diff>